<commit_message>
Update rubik1.docx with new content
</commit_message>
<xml_diff>
--- a/25410328_Tuan/25410328_rubik1.docx
+++ b/25410328_Tuan/25410328_rubik1.docx
@@ -99,7 +99,7 @@
           <w:szCs w:val="28"/>
         </w:rPr>
         <w:drawing>
-          <wp:inline distT="0" distB="0" distL="0" distR="0" wp14:anchorId="01361D85" wp14:editId="141716DD">
+          <wp:inline distT="0" distB="0" distL="0" distR="0" wp14:anchorId="04C88F6F" wp14:editId="1D33461B">
             <wp:extent cx="1711974" cy="1156956"/>
             <wp:effectExtent l="0" t="0" r="0" b="0"/>
             <wp:docPr id="2" name="image1.png" descr="A blue logo with a planet and a flower&#10;&#10;AI-generated content may be incorrect."/>
@@ -2090,23 +2090,25 @@
           <w:i/>
           <w:sz w:val="26"/>
         </w:rPr>
-        <w:t>Q</w:t>
-      </w:r>
+        <w:t xml:space="preserve">Quy </w:t>
+      </w:r>
+      <w:proofErr w:type="spellStart"/>
       <w:r>
         <w:rPr>
           <w:rFonts w:ascii="Times New Roman" w:eastAsia="Times New Roman" w:hAnsi="Times New Roman"/>
           <w:i/>
           <w:sz w:val="26"/>
         </w:rPr>
-        <w:t>u</w:t>
-      </w:r>
+        <w:t>trình</w:t>
+      </w:r>
+      <w:proofErr w:type="spellEnd"/>
       <w:r>
         <w:rPr>
           <w:rFonts w:ascii="Times New Roman" w:eastAsia="Times New Roman" w:hAnsi="Times New Roman"/>
           <w:i/>
           <w:sz w:val="26"/>
         </w:rPr>
-        <w:t xml:space="preserve">y </w:t>
+        <w:t xml:space="preserve"> </w:t>
       </w:r>
       <w:proofErr w:type="spellStart"/>
       <w:r>
@@ -2115,7 +2117,7 @@
           <w:i/>
           <w:sz w:val="26"/>
         </w:rPr>
-        <w:t>trình</w:t>
+        <w:t>quản</w:t>
       </w:r>
       <w:proofErr w:type="spellEnd"/>
       <w:r>
@@ -2133,7 +2135,7 @@
           <w:i/>
           <w:sz w:val="26"/>
         </w:rPr>
-        <w:t>quản</w:t>
+        <w:t>lý</w:t>
       </w:r>
       <w:proofErr w:type="spellEnd"/>
       <w:r>
@@ -2151,7 +2153,7 @@
           <w:i/>
           <w:sz w:val="26"/>
         </w:rPr>
-        <w:t>lý kho</w:t>
+        <w:t>kho</w:t>
       </w:r>
       <w:proofErr w:type="spellEnd"/>
       <w:r>
@@ -2195,23 +2197,11 @@
           <w:sz w:val="26"/>
           <w:szCs w:val="26"/>
         </w:rPr>
-        <w:t xml:space="preserve"> </w:t>
-      </w:r>
-      <w:r>
-        <w:rPr>
-          <w:rFonts w:ascii="Times New Roman" w:eastAsia="Times New Roman" w:hAnsi="Times New Roman" w:cs="Times New Roman"/>
-          <w:b/>
-          <w:bCs/>
-          <w:i/>
-          <w:iCs/>
-          <w:sz w:val="26"/>
-          <w:szCs w:val="26"/>
-        </w:rPr>
         <w:drawing>
-          <wp:inline distT="0" distB="0" distL="0" distR="0" wp14:anchorId="34162AED" wp14:editId="4A31D756">
-            <wp:extent cx="5943600" cy="662940"/>
+          <wp:inline distT="0" distB="0" distL="0" distR="0" wp14:anchorId="46253B4D" wp14:editId="06E67343">
+            <wp:extent cx="5943600" cy="700405"/>
             <wp:effectExtent l="0" t="0" r="0" b="0"/>
-            <wp:docPr id="1219686545" name="Picture 1"/>
+            <wp:docPr id="1041408961" name="Picture 1"/>
             <wp:cNvGraphicFramePr>
               <a:graphicFrameLocks xmlns:a="http://schemas.openxmlformats.org/drawingml/2006/main" noChangeAspect="1"/>
             </wp:cNvGraphicFramePr>
@@ -2219,7 +2209,7 @@
               <a:graphicData uri="http://schemas.openxmlformats.org/drawingml/2006/picture">
                 <pic:pic xmlns:pic="http://schemas.openxmlformats.org/drawingml/2006/picture">
                   <pic:nvPicPr>
-                    <pic:cNvPr id="1219686545" name=""/>
+                    <pic:cNvPr id="1041408961" name=""/>
                     <pic:cNvPicPr/>
                   </pic:nvPicPr>
                   <pic:blipFill>
@@ -2231,7 +2221,155 @@
                   <pic:spPr>
                     <a:xfrm>
                       <a:off x="0" y="0"/>
-                      <a:ext cx="5943600" cy="662940"/>
+                      <a:ext cx="5943600" cy="700405"/>
+                    </a:xfrm>
+                    <a:prstGeom prst="rect">
+                      <a:avLst/>
+                    </a:prstGeom>
+                  </pic:spPr>
+                </pic:pic>
+              </a:graphicData>
+            </a:graphic>
+          </wp:inline>
+        </w:drawing>
+      </w:r>
+      <w:r>
+        <w:rPr>
+          <w:rFonts w:ascii="Times New Roman" w:eastAsia="Times New Roman" w:hAnsi="Times New Roman" w:cs="Times New Roman"/>
+          <w:b/>
+          <w:bCs/>
+          <w:i/>
+          <w:iCs/>
+          <w:sz w:val="26"/>
+          <w:szCs w:val="26"/>
+        </w:rPr>
+        <w:t xml:space="preserve"> </w:t>
+      </w:r>
+    </w:p>
+    <w:p>
+      <w:pPr>
+        <w:spacing w:after="80" w:line="336" w:lineRule="auto"/>
+        <w:ind w:left="372" w:firstLine="720"/>
+      </w:pPr>
+      <w:r>
+        <w:rPr>
+          <w:rFonts w:ascii="Times New Roman" w:eastAsia="Times New Roman" w:hAnsi="Times New Roman"/>
+          <w:b/>
+          <w:sz w:val="26"/>
+        </w:rPr>
+        <w:t>1.1.2 Quy trình quản lý bán hàng và tư vấn tại quầy (GPP)</w:t>
+      </w:r>
+    </w:p>
+    <w:p>
+      <w:pPr>
+        <w:ind w:left="1440" w:firstLine="720"/>
+      </w:pPr>
+      <w:r>
+        <w:rPr>
+          <w:rFonts w:ascii="Times New Roman" w:eastAsia="Times New Roman" w:hAnsi="Times New Roman"/>
+          <w:sz w:val="26"/>
+        </w:rPr>
+        <w:t>Quy trình quản lý bán hàng và tư vấn tại quầy (GPP)</w:t>
+      </w:r>
+    </w:p>
+    <w:p>
+      <w:pPr>
+        <w:jc w:val="center"/>
+      </w:pPr>
+      <w:r>
+        <w:drawing>
+          <wp:inline distT="0" distB="0" distL="0" distR="0" wp14:anchorId="22F4147D" wp14:editId="6811AA01">
+            <wp:extent cx="5943600" cy="792480"/>
+            <wp:effectExtent l="0" t="0" r="0" b="0"/>
+            <wp:docPr id="1775854158" name="Picture 1" descr="A green rectangle with black text&#10;&#10;AI-generated content may be incorrect."/>
+            <wp:cNvGraphicFramePr>
+              <a:graphicFrameLocks xmlns:a="http://schemas.openxmlformats.org/drawingml/2006/main" noChangeAspect="1"/>
+            </wp:cNvGraphicFramePr>
+            <a:graphic xmlns:a="http://schemas.openxmlformats.org/drawingml/2006/main">
+              <a:graphicData uri="http://schemas.openxmlformats.org/drawingml/2006/picture">
+                <pic:pic xmlns:pic="http://schemas.openxmlformats.org/drawingml/2006/picture">
+                  <pic:nvPicPr>
+                    <pic:cNvPr id="1775854158" name="Picture 1" descr="A green rectangle with black text&#10;&#10;AI-generated content may be incorrect."/>
+                    <pic:cNvPicPr/>
+                  </pic:nvPicPr>
+                  <pic:blipFill>
+                    <a:blip r:embed="rId9"/>
+                    <a:stretch>
+                      <a:fillRect/>
+                    </a:stretch>
+                  </pic:blipFill>
+                  <pic:spPr>
+                    <a:xfrm>
+                      <a:off x="0" y="0"/>
+                      <a:ext cx="5943600" cy="792480"/>
+                    </a:xfrm>
+                    <a:prstGeom prst="rect">
+                      <a:avLst/>
+                    </a:prstGeom>
+                  </pic:spPr>
+                </pic:pic>
+              </a:graphicData>
+            </a:graphic>
+          </wp:inline>
+        </w:drawing>
+      </w:r>
+    </w:p>
+    <w:p>
+      <w:pPr>
+        <w:spacing w:after="80" w:line="336" w:lineRule="auto"/>
+        <w:ind w:left="372" w:firstLine="720"/>
+      </w:pPr>
+      <w:r>
+        <w:rPr>
+          <w:rFonts w:ascii="Times New Roman" w:eastAsia="Times New Roman" w:hAnsi="Times New Roman"/>
+          <w:b/>
+          <w:sz w:val="26"/>
+        </w:rPr>
+        <w:t>1.1.3 Quy trình quản lý nhân sự và đào tạo dược sĩ</w:t>
+      </w:r>
+    </w:p>
+    <w:p>
+      <w:pPr>
+        <w:ind w:left="1440" w:firstLine="720"/>
+      </w:pPr>
+      <w:r>
+        <w:rPr>
+          <w:rFonts w:ascii="Times New Roman" w:eastAsia="Times New Roman" w:hAnsi="Times New Roman"/>
+          <w:sz w:val="26"/>
+        </w:rPr>
+        <w:t>Quy trình quản lý nhân sự và đào tạo dược sĩ</w:t>
+      </w:r>
+    </w:p>
+    <w:p>
+      <w:pPr>
+        <w:jc w:val="center"/>
+      </w:pPr>
+      <w:r>
+        <w:drawing>
+          <wp:inline distT="0" distB="0" distL="0" distR="0" wp14:anchorId="65EA1102" wp14:editId="706B4D08">
+            <wp:extent cx="5943600" cy="763905"/>
+            <wp:effectExtent l="0" t="0" r="0" b="0"/>
+            <wp:docPr id="1185004692" name="Picture 1" descr="A green card with black text&#10;&#10;AI-generated content may be incorrect."/>
+            <wp:cNvGraphicFramePr>
+              <a:graphicFrameLocks xmlns:a="http://schemas.openxmlformats.org/drawingml/2006/main" noChangeAspect="1"/>
+            </wp:cNvGraphicFramePr>
+            <a:graphic xmlns:a="http://schemas.openxmlformats.org/drawingml/2006/main">
+              <a:graphicData uri="http://schemas.openxmlformats.org/drawingml/2006/picture">
+                <pic:pic xmlns:pic="http://schemas.openxmlformats.org/drawingml/2006/picture">
+                  <pic:nvPicPr>
+                    <pic:cNvPr id="1185004692" name="Picture 1" descr="A green card with black text&#10;&#10;AI-generated content may be incorrect."/>
+                    <pic:cNvPicPr/>
+                  </pic:nvPicPr>
+                  <pic:blipFill>
+                    <a:blip r:embed="rId10"/>
+                    <a:stretch>
+                      <a:fillRect/>
+                    </a:stretch>
+                  </pic:blipFill>
+                  <pic:spPr>
+                    <a:xfrm>
+                      <a:off x="0" y="0"/>
+                      <a:ext cx="5943600" cy="763905"/>
                     </a:xfrm>
                     <a:prstGeom prst="rect">
                       <a:avLst/>
@@ -3064,7 +3202,11 @@
       </w:r>
       <w:proofErr w:type="spellEnd"/>
       <w:r>
-        <w:t xml:space="preserve"> (</w:t>
+        <w:t xml:space="preserve"> </w:t>
+      </w:r>
+      <w:r>
+        <w:lastRenderedPageBreak/>
+        <w:t>(</w:t>
       </w:r>
       <w:proofErr w:type="spellStart"/>
       <w:r>
@@ -4710,7 +4852,6 @@
       </w:r>
       <w:proofErr w:type="spellStart"/>
       <w:r>
-        <w:lastRenderedPageBreak/>
         <w:t>phù</w:t>
       </w:r>
       <w:proofErr w:type="spellEnd"/>
@@ -6907,6 +7048,7 @@
         <w:rPr>
           <w:b/>
         </w:rPr>
+        <w:lastRenderedPageBreak/>
         <w:t>Bộ</w:t>
       </w:r>
       <w:proofErr w:type="spellEnd"/>
@@ -10372,6 +10514,1062 @@
       <w:proofErr w:type="spellEnd"/>
       <w:r>
         <w:t>.</w:t>
+      </w:r>
+    </w:p>
+    <w:p>
+      <w:pPr>
+        <w:numPr>
+          <w:ilvl w:val="1"/>
+          <w:numId w:val="1"/>
+        </w:numPr>
+        <w:spacing w:after="0"/>
+        <w:ind w:left="1092" w:hanging="372"/>
+        <w:rPr>
+          <w:rFonts w:ascii="Times New Roman" w:eastAsia="Times New Roman" w:hAnsi="Times New Roman" w:cs="Times New Roman"/>
+          <w:b/>
+          <w:bCs/>
+          <w:i/>
+          <w:iCs/>
+          <w:sz w:val="26"/>
+          <w:szCs w:val="26"/>
+        </w:rPr>
+      </w:pPr>
+      <w:r>
+        <w:rPr>
+          <w:rFonts w:ascii="Times New Roman" w:eastAsia="Times New Roman" w:hAnsi="Times New Roman"/>
+          <w:b/>
+          <w:sz w:val="26"/>
+        </w:rPr>
+        <w:t>Quy trình quản lý bán hàng và tư vấn tại quầy (GPP)</w:t>
+      </w:r>
+    </w:p>
+    <w:p>
+      <w:pPr>
+        <w:numPr>
+          <w:ilvl w:val="2"/>
+          <w:numId w:val="1"/>
+        </w:numPr>
+        <w:spacing w:after="0"/>
+        <w:ind w:left="1800" w:hanging="720"/>
+        <w:rPr>
+          <w:rFonts w:ascii="Times New Roman" w:eastAsia="Times New Roman" w:hAnsi="Times New Roman" w:cs="Times New Roman"/>
+          <w:b/>
+          <w:bCs/>
+          <w:i/>
+          <w:iCs/>
+          <w:sz w:val="26"/>
+          <w:szCs w:val="26"/>
+        </w:rPr>
+      </w:pPr>
+      <w:r>
+        <w:rPr>
+          <w:rFonts w:ascii="Times New Roman" w:eastAsia="Times New Roman" w:hAnsi="Times New Roman"/>
+          <w:b/>
+          <w:sz w:val="26"/>
+        </w:rPr>
+        <w:t>Mô tả quy trình</w:t>
+      </w:r>
+    </w:p>
+    <w:p>
+      <w:pPr>
+        <w:pStyle w:val="ListParagraph"/>
+        <w:numPr>
+          <w:ilvl w:val="0"/>
+          <w:numId w:val="7"/>
+        </w:numPr>
+        <w:spacing w:after="0"/>
+        <w:rPr>
+          <w:rFonts w:ascii="Times New Roman" w:eastAsia="Times New Roman" w:hAnsi="Times New Roman" w:cs="Times New Roman"/>
+          <w:b/>
+          <w:bCs/>
+          <w:i/>
+          <w:iCs/>
+          <w:sz w:val="26"/>
+          <w:szCs w:val="26"/>
+        </w:rPr>
+      </w:pPr>
+      <w:r>
+        <w:rPr>
+          <w:rFonts w:ascii="Times New Roman" w:eastAsia="Times New Roman" w:hAnsi="Times New Roman"/>
+          <w:b/>
+          <w:sz w:val="26"/>
+        </w:rPr>
+        <w:lastRenderedPageBreak/>
+        <w:t xml:space="preserve">Đón tiếp và tiếp nhận nhu cầu: </w:t>
+      </w:r>
+      <w:r>
+        <w:rPr>
+          <w:rFonts w:ascii="Times New Roman" w:eastAsia="Times New Roman" w:hAnsi="Times New Roman"/>
+          <w:sz w:val="26"/>
+        </w:rPr>
+        <w:t>dược sĩ đón tiếp khách hàng, tiếp nhận đơn thuốc hoặc lắng nghe nhu cầu mua thuốc, thực phẩm chức năng và nhu cầu tư vấn sức khỏe. Với đơn thuốc, dược sĩ kiểm tra tính hợp lệ trước khi tư vấn.</w:t>
+      </w:r>
+    </w:p>
+    <w:p>
+      <w:pPr>
+        <w:pStyle w:val="ListParagraph"/>
+        <w:numPr>
+          <w:ilvl w:val="0"/>
+          <w:numId w:val="7"/>
+        </w:numPr>
+        <w:spacing w:after="0"/>
+        <w:rPr>
+          <w:rFonts w:ascii="Times New Roman" w:eastAsia="Times New Roman" w:hAnsi="Times New Roman" w:cs="Times New Roman"/>
+          <w:b/>
+          <w:bCs/>
+          <w:i/>
+          <w:iCs/>
+          <w:sz w:val="26"/>
+          <w:szCs w:val="26"/>
+        </w:rPr>
+      </w:pPr>
+      <w:r>
+        <w:rPr>
+          <w:rFonts w:ascii="Times New Roman" w:eastAsia="Times New Roman" w:hAnsi="Times New Roman"/>
+          <w:b/>
+          <w:sz w:val="26"/>
+        </w:rPr>
+        <w:t xml:space="preserve">Tư vấn và khai thác thông tin: </w:t>
+      </w:r>
+      <w:r>
+        <w:rPr>
+          <w:rFonts w:ascii="Times New Roman" w:eastAsia="Times New Roman" w:hAnsi="Times New Roman"/>
+          <w:sz w:val="26"/>
+        </w:rPr>
+        <w:t>khai thác triệu chứng, tiền sử bệnh, tình trạng dị ứng và thuốc đang dùng của khách; tư vấn thuốc, liều dùng và cách dùng phù hợp theo tiêu chuẩn Thực hành tốt nhà thuốc (GPP). Đối với thuốc kê đơn, bắt buộc phải có đơn thuốc hợp lệ của bác sĩ.</w:t>
+      </w:r>
+    </w:p>
+    <w:p>
+      <w:pPr>
+        <w:pStyle w:val="ListParagraph"/>
+        <w:numPr>
+          <w:ilvl w:val="0"/>
+          <w:numId w:val="7"/>
+        </w:numPr>
+        <w:spacing w:after="0"/>
+        <w:rPr>
+          <w:rFonts w:ascii="Times New Roman" w:eastAsia="Times New Roman" w:hAnsi="Times New Roman" w:cs="Times New Roman"/>
+          <w:b/>
+          <w:bCs/>
+          <w:i/>
+          <w:iCs/>
+          <w:sz w:val="26"/>
+          <w:szCs w:val="26"/>
+        </w:rPr>
+      </w:pPr>
+      <w:r>
+        <w:rPr>
+          <w:rFonts w:ascii="Times New Roman" w:eastAsia="Times New Roman" w:hAnsi="Times New Roman"/>
+          <w:b/>
+          <w:sz w:val="26"/>
+        </w:rPr>
+        <w:t xml:space="preserve">Kiểm tra và soạn thuốc: </w:t>
+      </w:r>
+      <w:r>
+        <w:rPr>
+          <w:rFonts w:ascii="Times New Roman" w:eastAsia="Times New Roman" w:hAnsi="Times New Roman"/>
+          <w:sz w:val="26"/>
+        </w:rPr>
+        <w:t>dược sĩ kiểm tra tồn kho, hạn sử dụng, đối chiếu với đơn hoặc nhu cầu và soạn đúng thuốc, đúng hàm lượng, đúng số lượng cho khách hàng.</w:t>
+      </w:r>
+    </w:p>
+    <w:p>
+      <w:pPr>
+        <w:pStyle w:val="ListParagraph"/>
+        <w:numPr>
+          <w:ilvl w:val="0"/>
+          <w:numId w:val="7"/>
+        </w:numPr>
+        <w:spacing w:after="0"/>
+        <w:rPr>
+          <w:rFonts w:ascii="Times New Roman" w:eastAsia="Times New Roman" w:hAnsi="Times New Roman" w:cs="Times New Roman"/>
+          <w:b/>
+          <w:bCs/>
+          <w:i/>
+          <w:iCs/>
+          <w:sz w:val="26"/>
+          <w:szCs w:val="26"/>
+        </w:rPr>
+      </w:pPr>
+      <w:r>
+        <w:rPr>
+          <w:rFonts w:ascii="Times New Roman" w:eastAsia="Times New Roman" w:hAnsi="Times New Roman"/>
+          <w:b/>
+          <w:sz w:val="26"/>
+        </w:rPr>
+        <w:t xml:space="preserve">Thanh toán và xuất hóa đơn: </w:t>
+      </w:r>
+      <w:r>
+        <w:rPr>
+          <w:rFonts w:ascii="Times New Roman" w:eastAsia="Times New Roman" w:hAnsi="Times New Roman"/>
+          <w:sz w:val="26"/>
+        </w:rPr>
+        <w:t>nhân viên nhập sản phẩm lên phần mềm bán hàng (POS), áp dụng chương trình khuyến mãi hoặc tích điểm thành viên, thu tiền, xuất hóa đơn và hệ thống tự động trừ tồn kho.</w:t>
+      </w:r>
+    </w:p>
+    <w:p>
+      <w:pPr>
+        <w:pStyle w:val="ListParagraph"/>
+        <w:numPr>
+          <w:ilvl w:val="0"/>
+          <w:numId w:val="7"/>
+        </w:numPr>
+        <w:spacing w:after="0"/>
+        <w:rPr>
+          <w:rFonts w:ascii="Times New Roman" w:eastAsia="Times New Roman" w:hAnsi="Times New Roman" w:cs="Times New Roman"/>
+          <w:b/>
+          <w:bCs/>
+          <w:i/>
+          <w:iCs/>
+          <w:sz w:val="26"/>
+          <w:szCs w:val="26"/>
+        </w:rPr>
+      </w:pPr>
+      <w:r>
+        <w:rPr>
+          <w:rFonts w:ascii="Times New Roman" w:eastAsia="Times New Roman" w:hAnsi="Times New Roman"/>
+          <w:b/>
+          <w:sz w:val="26"/>
+        </w:rPr>
+        <w:t xml:space="preserve">Hướng dẫn sử dụng và chăm sóc sau bán: </w:t>
+      </w:r>
+      <w:r>
+        <w:rPr>
+          <w:rFonts w:ascii="Times New Roman" w:eastAsia="Times New Roman" w:hAnsi="Times New Roman"/>
+          <w:sz w:val="26"/>
+        </w:rPr>
+        <w:t>hướng dẫn khách cách dùng, liều lượng, thời điểm dùng và các lưu ý khi sử dụng thuốc; ghi nhận thông tin khách hàng vào hệ thống và nhắc lịch tái khám hoặc mua lại khi cần thiết.</w:t>
+      </w:r>
+    </w:p>
+    <w:p>
+      <w:pPr>
+        <w:numPr>
+          <w:ilvl w:val="2"/>
+          <w:numId w:val="1"/>
+        </w:numPr>
+        <w:spacing w:after="0"/>
+        <w:ind w:left="1800" w:hanging="720"/>
+        <w:rPr>
+          <w:rFonts w:ascii="Times New Roman" w:eastAsia="Times New Roman" w:hAnsi="Times New Roman" w:cs="Times New Roman"/>
+          <w:b/>
+          <w:bCs/>
+          <w:i/>
+          <w:iCs/>
+          <w:sz w:val="26"/>
+          <w:szCs w:val="26"/>
+        </w:rPr>
+      </w:pPr>
+      <w:r>
+        <w:rPr>
+          <w:rFonts w:ascii="Times New Roman" w:eastAsia="Times New Roman" w:hAnsi="Times New Roman"/>
+          <w:b/>
+          <w:sz w:val="26"/>
+        </w:rPr>
+        <w:t>Phân tích quy trình</w:t>
+      </w:r>
+    </w:p>
+    <w:p>
+      <w:pPr>
+        <w:numPr>
+          <w:ilvl w:val="3"/>
+          <w:numId w:val="1"/>
+        </w:numPr>
+        <w:spacing w:after="0"/>
+        <w:rPr>
+          <w:rFonts w:ascii="Times New Roman" w:eastAsia="Times New Roman" w:hAnsi="Times New Roman" w:cs="Times New Roman"/>
+          <w:b/>
+          <w:bCs/>
+          <w:i/>
+          <w:iCs/>
+          <w:sz w:val="26"/>
+          <w:szCs w:val="26"/>
+        </w:rPr>
+      </w:pPr>
+      <w:r>
+        <w:rPr>
+          <w:rFonts w:ascii="Times New Roman" w:eastAsia="Times New Roman" w:hAnsi="Times New Roman"/>
+          <w:b/>
+          <w:sz w:val="26"/>
+        </w:rPr>
+        <w:t>Các tác nhân tham gia quy trình</w:t>
+      </w:r>
+    </w:p>
+    <w:p>
+      <w:pPr>
+        <w:pStyle w:val="ListBullet"/>
+        <w:numPr>
+          <w:ilvl w:val="0"/>
+          <w:numId w:val="11"/>
+        </w:numPr>
+        <w:spacing w:after="60" w:line="336" w:lineRule="auto"/>
+      </w:pPr>
+      <w:r>
+        <w:rPr>
+          <w:b/>
+        </w:rPr>
+        <w:t xml:space="preserve">Khách hàng: </w:t>
+      </w:r>
+      <w:r>
+        <w:t>người đến nhà thuốc để mua thuốc, thực phẩm chức năng hoặc cần được tư vấn sức khỏe.</w:t>
+      </w:r>
+    </w:p>
+    <w:p>
+      <w:pPr>
+        <w:pStyle w:val="ListBullet"/>
+        <w:numPr>
+          <w:ilvl w:val="0"/>
+          <w:numId w:val="11"/>
+        </w:numPr>
+        <w:spacing w:after="60" w:line="336" w:lineRule="auto"/>
+      </w:pPr>
+      <w:r>
+        <w:rPr>
+          <w:b/>
+        </w:rPr>
+        <w:t xml:space="preserve">Dược sĩ / nhân viên bán hàng: </w:t>
+      </w:r>
+      <w:r>
+        <w:t>người trực tiếp tư vấn, soạn thuốc và bán hàng theo đúng chuẩn GPP.</w:t>
+      </w:r>
+    </w:p>
+    <w:p>
+      <w:pPr>
+        <w:pStyle w:val="ListBullet"/>
+        <w:numPr>
+          <w:ilvl w:val="0"/>
+          <w:numId w:val="11"/>
+        </w:numPr>
+        <w:spacing w:after="60" w:line="336" w:lineRule="auto"/>
+      </w:pPr>
+      <w:r>
+        <w:rPr>
+          <w:b/>
+        </w:rPr>
+        <w:t xml:space="preserve">Quản lý nhà thuốc: </w:t>
+      </w:r>
+      <w:r>
+        <w:t>giám sát hoạt động bán hàng và xử lý các tình huống phát sinh tại cửa hàng.</w:t>
+      </w:r>
+    </w:p>
+    <w:p>
+      <w:pPr>
+        <w:pStyle w:val="ListBullet"/>
+        <w:numPr>
+          <w:ilvl w:val="0"/>
+          <w:numId w:val="11"/>
+        </w:numPr>
+        <w:spacing w:after="60" w:line="336" w:lineRule="auto"/>
+      </w:pPr>
+      <w:r>
+        <w:rPr>
+          <w:b/>
+        </w:rPr>
+        <w:t xml:space="preserve">Hệ thống POS / phần mềm bán hàng: </w:t>
+      </w:r>
+      <w:r>
+        <w:t>ghi nhận giao dịch, quản lý giá bán, khuyến mãi và tồn kho theo thời gian thực.</w:t>
+      </w:r>
+    </w:p>
+    <w:p>
+      <w:pPr>
+        <w:pStyle w:val="ListBullet"/>
+        <w:numPr>
+          <w:ilvl w:val="0"/>
+          <w:numId w:val="11"/>
+        </w:numPr>
+        <w:spacing w:after="60" w:line="336" w:lineRule="auto"/>
+      </w:pPr>
+      <w:r>
+        <w:rPr>
+          <w:b/>
+        </w:rPr>
+        <w:t xml:space="preserve">Bộ phận chăm sóc khách hàng: </w:t>
+      </w:r>
+      <w:r>
+        <w:t>tiếp nhận phản hồi, khiếu nại và chăm sóc khách hàng sau bán.</w:t>
+      </w:r>
+    </w:p>
+    <w:p>
+      <w:pPr>
+        <w:numPr>
+          <w:ilvl w:val="3"/>
+          <w:numId w:val="1"/>
+        </w:numPr>
+        <w:spacing w:after="0"/>
+        <w:rPr>
+          <w:rFonts w:ascii="Times New Roman" w:eastAsia="Times New Roman" w:hAnsi="Times New Roman" w:cs="Times New Roman"/>
+          <w:b/>
+          <w:bCs/>
+          <w:i/>
+          <w:iCs/>
+          <w:sz w:val="26"/>
+          <w:szCs w:val="26"/>
+        </w:rPr>
+      </w:pPr>
+      <w:r>
+        <w:rPr>
+          <w:rFonts w:ascii="Times New Roman" w:eastAsia="Times New Roman" w:hAnsi="Times New Roman"/>
+          <w:b/>
+          <w:sz w:val="26"/>
+        </w:rPr>
+        <w:t>Khách hàng của quy trình này</w:t>
+      </w:r>
+    </w:p>
+    <w:p>
+      <w:pPr>
+        <w:pStyle w:val="ListParagraph"/>
+        <w:spacing w:after="80" w:line="336" w:lineRule="auto"/>
+        <w:ind w:left="1440" w:firstLine="720"/>
+      </w:pPr>
+      <w:r>
+        <w:rPr>
+          <w:rFonts w:ascii="Times New Roman" w:eastAsia="Times New Roman" w:hAnsi="Times New Roman"/>
+          <w:sz w:val="26"/>
+        </w:rPr>
+        <w:t xml:space="preserve">Khách hàng của quy trình chính là người tiêu dùng đến nhà thuốc, vì họ là đối tượng trực tiếp được tư vấn và mua sản phẩm. Quy trình giúp </w:t>
+      </w:r>
+      <w:r>
+        <w:rPr>
+          <w:rFonts w:ascii="Times New Roman" w:eastAsia="Times New Roman" w:hAnsi="Times New Roman"/>
+          <w:sz w:val="26"/>
+        </w:rPr>
+        <w:lastRenderedPageBreak/>
+        <w:t>khách mua đúng thuốc, được hướng dẫn sử dụng an toàn, hiệu quả và có trải nghiệm mua hàng tốt.</w:t>
+      </w:r>
+    </w:p>
+    <w:p>
+      <w:pPr>
+        <w:numPr>
+          <w:ilvl w:val="3"/>
+          <w:numId w:val="1"/>
+        </w:numPr>
+        <w:spacing w:after="0"/>
+        <w:rPr>
+          <w:rFonts w:ascii="Times New Roman" w:eastAsia="Times New Roman" w:hAnsi="Times New Roman" w:cs="Times New Roman"/>
+          <w:b/>
+          <w:bCs/>
+          <w:i/>
+          <w:iCs/>
+          <w:sz w:val="26"/>
+          <w:szCs w:val="26"/>
+        </w:rPr>
+      </w:pPr>
+      <w:r>
+        <w:rPr>
+          <w:rFonts w:ascii="Times New Roman" w:eastAsia="Times New Roman" w:hAnsi="Times New Roman"/>
+          <w:b/>
+          <w:sz w:val="26"/>
+        </w:rPr>
+        <w:t>Những khả năng kết quả của quy trình</w:t>
+      </w:r>
+    </w:p>
+    <w:p>
+      <w:pPr>
+        <w:spacing w:after="80" w:line="336" w:lineRule="auto"/>
+        <w:ind w:left="1080"/>
+      </w:pPr>
+      <w:r>
+        <w:rPr>
+          <w:rFonts w:ascii="Times New Roman" w:eastAsia="Times New Roman" w:hAnsi="Times New Roman"/>
+          <w:b/>
+          <w:sz w:val="26"/>
+        </w:rPr>
+        <w:t xml:space="preserve">Kết quả tích cực: </w:t>
+      </w:r>
+      <w:r>
+        <w:rPr>
+          <w:rFonts w:ascii="Times New Roman" w:eastAsia="Times New Roman" w:hAnsi="Times New Roman"/>
+          <w:sz w:val="26"/>
+        </w:rPr>
+        <w:t>khách hàng được tư vấn đúng và mua đúng thuốc, hài lòng và quay lại; nhà thuốc tuân thủ đầy đủ tiêu chuẩn GPP; giao dịch nhanh, chính xác và doanh thu tăng trưởng ổn định.</w:t>
+      </w:r>
+    </w:p>
+    <w:p>
+      <w:pPr>
+        <w:spacing w:after="80" w:line="336" w:lineRule="auto"/>
+        <w:ind w:left="1080"/>
+      </w:pPr>
+      <w:r>
+        <w:rPr>
+          <w:rFonts w:ascii="Times New Roman" w:eastAsia="Times New Roman" w:hAnsi="Times New Roman"/>
+          <w:b/>
+          <w:sz w:val="26"/>
+        </w:rPr>
+        <w:t>Kết quả tiêu cực:</w:t>
+      </w:r>
+    </w:p>
+    <w:p>
+      <w:pPr>
+        <w:pStyle w:val="ListBullet"/>
+        <w:spacing w:after="60" w:line="336" w:lineRule="auto"/>
+        <w:ind w:left="1080"/>
+      </w:pPr>
+      <w:r>
+        <w:t>Tư vấn sai hoặc bán nhầm thuốc, gây ảnh hưởng đến sức khỏe khách hàng và uy tín thương hiệu.</w:t>
+      </w:r>
+    </w:p>
+    <w:p>
+      <w:pPr>
+        <w:pStyle w:val="ListBullet"/>
+        <w:spacing w:after="60" w:line="336" w:lineRule="auto"/>
+        <w:ind w:left="1080"/>
+      </w:pPr>
+      <w:r>
+        <w:t>Bán thuốc kê đơn khi không có đơn hợp lệ, vi phạm quy định và có thể bị cơ quan chức năng xử phạt.</w:t>
+      </w:r>
+    </w:p>
+    <w:p>
+      <w:pPr>
+        <w:pStyle w:val="ListBullet"/>
+        <w:spacing w:after="60" w:line="336" w:lineRule="auto"/>
+        <w:ind w:left="1080"/>
+      </w:pPr>
+      <w:r>
+        <w:t>Khách phải chờ lâu do thiếu nhân viên hoặc thao tác chậm, làm giảm trải nghiệm mua hàng.</w:t>
+      </w:r>
+    </w:p>
+    <w:p>
+      <w:pPr>
+        <w:pStyle w:val="ListBullet"/>
+        <w:spacing w:after="60" w:line="336" w:lineRule="auto"/>
+        <w:ind w:left="1080"/>
+      </w:pPr>
+      <w:r>
+        <w:t>Sai sót trong thanh toán, tính giá hoặc trừ tồn kho gây lệch số liệu và thất thoát cho cửa hàng.</w:t>
+      </w:r>
+    </w:p>
+    <w:p>
+      <w:pPr>
+        <w:numPr>
+          <w:ilvl w:val="1"/>
+          <w:numId w:val="1"/>
+        </w:numPr>
+        <w:spacing w:after="0"/>
+        <w:ind w:left="1092" w:hanging="372"/>
+        <w:rPr>
+          <w:rFonts w:ascii="Times New Roman" w:eastAsia="Times New Roman" w:hAnsi="Times New Roman" w:cs="Times New Roman"/>
+          <w:b/>
+          <w:bCs/>
+          <w:i/>
+          <w:iCs/>
+          <w:sz w:val="26"/>
+          <w:szCs w:val="26"/>
+        </w:rPr>
+      </w:pPr>
+      <w:r>
+        <w:rPr>
+          <w:rFonts w:ascii="Times New Roman" w:eastAsia="Times New Roman" w:hAnsi="Times New Roman"/>
+          <w:b/>
+          <w:sz w:val="26"/>
+        </w:rPr>
+        <w:t>Quy trình quản lý nhân sự và đào tạo dược sĩ</w:t>
+      </w:r>
+    </w:p>
+    <w:p>
+      <w:pPr>
+        <w:numPr>
+          <w:ilvl w:val="2"/>
+          <w:numId w:val="1"/>
+        </w:numPr>
+        <w:spacing w:after="0"/>
+        <w:ind w:left="1800" w:hanging="720"/>
+        <w:rPr>
+          <w:rFonts w:ascii="Times New Roman" w:eastAsia="Times New Roman" w:hAnsi="Times New Roman" w:cs="Times New Roman"/>
+          <w:b/>
+          <w:bCs/>
+          <w:i/>
+          <w:iCs/>
+          <w:sz w:val="26"/>
+          <w:szCs w:val="26"/>
+        </w:rPr>
+      </w:pPr>
+      <w:r>
+        <w:rPr>
+          <w:rFonts w:ascii="Times New Roman" w:eastAsia="Times New Roman" w:hAnsi="Times New Roman"/>
+          <w:b/>
+          <w:sz w:val="26"/>
+        </w:rPr>
+        <w:t>Mô tả quy trình</w:t>
+      </w:r>
+    </w:p>
+    <w:p>
+      <w:pPr>
+        <w:pStyle w:val="ListParagraph"/>
+        <w:numPr>
+          <w:ilvl w:val="0"/>
+          <w:numId w:val="7"/>
+        </w:numPr>
+        <w:spacing w:after="0"/>
+        <w:rPr>
+          <w:rFonts w:ascii="Times New Roman" w:eastAsia="Times New Roman" w:hAnsi="Times New Roman" w:cs="Times New Roman"/>
+          <w:b/>
+          <w:bCs/>
+          <w:i/>
+          <w:iCs/>
+          <w:sz w:val="26"/>
+          <w:szCs w:val="26"/>
+        </w:rPr>
+      </w:pPr>
+      <w:r>
+        <w:rPr>
+          <w:rFonts w:ascii="Times New Roman" w:eastAsia="Times New Roman" w:hAnsi="Times New Roman"/>
+          <w:b/>
+          <w:sz w:val="26"/>
+        </w:rPr>
+        <w:t xml:space="preserve">Hoạch định và tuyển dụng: </w:t>
+      </w:r>
+      <w:r>
+        <w:rPr>
+          <w:rFonts w:ascii="Times New Roman" w:eastAsia="Times New Roman" w:hAnsi="Times New Roman"/>
+          <w:sz w:val="26"/>
+        </w:rPr>
+        <w:t>phòng nhân sự xác định nhu cầu nhân lực theo số lượng cửa hàng và ca làm việc, sau đó tuyển dụng dược sĩ và nhân viên đạt chuẩn về bằng cấp và chứng chỉ hành nghề dược.</w:t>
+      </w:r>
+    </w:p>
+    <w:p>
+      <w:pPr>
+        <w:pStyle w:val="ListParagraph"/>
+        <w:numPr>
+          <w:ilvl w:val="0"/>
+          <w:numId w:val="7"/>
+        </w:numPr>
+        <w:spacing w:after="0"/>
+        <w:rPr>
+          <w:rFonts w:ascii="Times New Roman" w:eastAsia="Times New Roman" w:hAnsi="Times New Roman" w:cs="Times New Roman"/>
+          <w:b/>
+          <w:bCs/>
+          <w:i/>
+          <w:iCs/>
+          <w:sz w:val="26"/>
+          <w:szCs w:val="26"/>
+        </w:rPr>
+      </w:pPr>
+      <w:r>
+        <w:rPr>
+          <w:rFonts w:ascii="Times New Roman" w:eastAsia="Times New Roman" w:hAnsi="Times New Roman"/>
+          <w:b/>
+          <w:sz w:val="26"/>
+        </w:rPr>
+        <w:t xml:space="preserve">Đào tạo hội nhập và chuyên môn: </w:t>
+      </w:r>
+      <w:r>
+        <w:rPr>
+          <w:rFonts w:ascii="Times New Roman" w:eastAsia="Times New Roman" w:hAnsi="Times New Roman"/>
+          <w:sz w:val="26"/>
+        </w:rPr>
+        <w:t>đào tạo nhân viên mới về quy trình bán hàng GPP, kiến thức dược, kỹ năng tư vấn và cách sử dụng phần mềm; tổ chức đào tạo định kỳ khi có sản phẩm mới hoặc thay đổi quy định.</w:t>
+      </w:r>
+    </w:p>
+    <w:p>
+      <w:pPr>
+        <w:pStyle w:val="ListParagraph"/>
+        <w:numPr>
+          <w:ilvl w:val="0"/>
+          <w:numId w:val="7"/>
+        </w:numPr>
+        <w:spacing w:after="0"/>
+        <w:rPr>
+          <w:rFonts w:ascii="Times New Roman" w:eastAsia="Times New Roman" w:hAnsi="Times New Roman" w:cs="Times New Roman"/>
+          <w:b/>
+          <w:bCs/>
+          <w:i/>
+          <w:iCs/>
+          <w:sz w:val="26"/>
+          <w:szCs w:val="26"/>
+        </w:rPr>
+      </w:pPr>
+      <w:r>
+        <w:rPr>
+          <w:rFonts w:ascii="Times New Roman" w:eastAsia="Times New Roman" w:hAnsi="Times New Roman"/>
+          <w:b/>
+          <w:sz w:val="26"/>
+        </w:rPr>
+        <w:t xml:space="preserve">Phân ca và quản lý vận hành: </w:t>
+      </w:r>
+      <w:r>
+        <w:rPr>
+          <w:rFonts w:ascii="Times New Roman" w:eastAsia="Times New Roman" w:hAnsi="Times New Roman"/>
+          <w:sz w:val="26"/>
+        </w:rPr>
+        <w:t>sắp xếp lịch trực, chấm công và đảm bảo mỗi cửa hàng luôn có dược sĩ phụ trách chuyên môn theo đúng quy định của pháp luật.</w:t>
+      </w:r>
+    </w:p>
+    <w:p>
+      <w:pPr>
+        <w:pStyle w:val="ListParagraph"/>
+        <w:numPr>
+          <w:ilvl w:val="0"/>
+          <w:numId w:val="7"/>
+        </w:numPr>
+        <w:spacing w:after="0"/>
+        <w:rPr>
+          <w:rFonts w:ascii="Times New Roman" w:eastAsia="Times New Roman" w:hAnsi="Times New Roman" w:cs="Times New Roman"/>
+          <w:b/>
+          <w:bCs/>
+          <w:i/>
+          <w:iCs/>
+          <w:sz w:val="26"/>
+          <w:szCs w:val="26"/>
+        </w:rPr>
+      </w:pPr>
+      <w:r>
+        <w:rPr>
+          <w:rFonts w:ascii="Times New Roman" w:eastAsia="Times New Roman" w:hAnsi="Times New Roman"/>
+          <w:b/>
+          <w:sz w:val="26"/>
+        </w:rPr>
+        <w:t xml:space="preserve">Đánh giá hiệu suất (KPI): </w:t>
+      </w:r>
+      <w:r>
+        <w:rPr>
+          <w:rFonts w:ascii="Times New Roman" w:eastAsia="Times New Roman" w:hAnsi="Times New Roman"/>
+          <w:sz w:val="26"/>
+        </w:rPr>
+        <w:t>theo dõi doanh số, chất lượng tư vấn và phản hồi của khách hàng để đánh giá hiệu quả làm việc của từng nhân viên theo định kỳ.</w:t>
+      </w:r>
+    </w:p>
+    <w:p>
+      <w:pPr>
+        <w:pStyle w:val="ListParagraph"/>
+        <w:numPr>
+          <w:ilvl w:val="0"/>
+          <w:numId w:val="7"/>
+        </w:numPr>
+        <w:spacing w:after="0"/>
+        <w:rPr>
+          <w:rFonts w:ascii="Times New Roman" w:eastAsia="Times New Roman" w:hAnsi="Times New Roman" w:cs="Times New Roman"/>
+          <w:b/>
+          <w:bCs/>
+          <w:i/>
+          <w:iCs/>
+          <w:sz w:val="26"/>
+          <w:szCs w:val="26"/>
+        </w:rPr>
+      </w:pPr>
+      <w:r>
+        <w:rPr>
+          <w:rFonts w:ascii="Times New Roman" w:eastAsia="Times New Roman" w:hAnsi="Times New Roman"/>
+          <w:b/>
+          <w:sz w:val="26"/>
+        </w:rPr>
+        <w:t xml:space="preserve">Đãi ngộ, phát triển và giữ chân: </w:t>
+      </w:r>
+      <w:r>
+        <w:rPr>
+          <w:rFonts w:ascii="Times New Roman" w:eastAsia="Times New Roman" w:hAnsi="Times New Roman"/>
+          <w:sz w:val="26"/>
+        </w:rPr>
+        <w:t>xây dựng chính sách lương thưởng, phúc lợi và lộ trình thăng tiến; xử lý các trường hợp nghỉ việc và tuyển dụng thay thế kịp thời.</w:t>
+      </w:r>
+    </w:p>
+    <w:p>
+      <w:pPr>
+        <w:numPr>
+          <w:ilvl w:val="2"/>
+          <w:numId w:val="1"/>
+        </w:numPr>
+        <w:spacing w:after="0"/>
+        <w:ind w:left="1800" w:hanging="720"/>
+        <w:rPr>
+          <w:rFonts w:ascii="Times New Roman" w:eastAsia="Times New Roman" w:hAnsi="Times New Roman" w:cs="Times New Roman"/>
+          <w:b/>
+          <w:bCs/>
+          <w:i/>
+          <w:iCs/>
+          <w:sz w:val="26"/>
+          <w:szCs w:val="26"/>
+        </w:rPr>
+      </w:pPr>
+      <w:r>
+        <w:rPr>
+          <w:rFonts w:ascii="Times New Roman" w:eastAsia="Times New Roman" w:hAnsi="Times New Roman"/>
+          <w:b/>
+          <w:sz w:val="26"/>
+        </w:rPr>
+        <w:t>Phân tích quy trình</w:t>
+      </w:r>
+    </w:p>
+    <w:p>
+      <w:pPr>
+        <w:numPr>
+          <w:ilvl w:val="3"/>
+          <w:numId w:val="1"/>
+        </w:numPr>
+        <w:spacing w:after="0"/>
+        <w:rPr>
+          <w:rFonts w:ascii="Times New Roman" w:eastAsia="Times New Roman" w:hAnsi="Times New Roman" w:cs="Times New Roman"/>
+          <w:b/>
+          <w:bCs/>
+          <w:i/>
+          <w:iCs/>
+          <w:sz w:val="26"/>
+          <w:szCs w:val="26"/>
+        </w:rPr>
+      </w:pPr>
+      <w:r>
+        <w:rPr>
+          <w:rFonts w:ascii="Times New Roman" w:eastAsia="Times New Roman" w:hAnsi="Times New Roman"/>
+          <w:b/>
+          <w:sz w:val="26"/>
+        </w:rPr>
+        <w:lastRenderedPageBreak/>
+        <w:t>Các tác nhân tham gia quy trình</w:t>
+      </w:r>
+    </w:p>
+    <w:p>
+      <w:pPr>
+        <w:pStyle w:val="ListBullet"/>
+        <w:numPr>
+          <w:ilvl w:val="0"/>
+          <w:numId w:val="11"/>
+        </w:numPr>
+        <w:spacing w:after="60" w:line="336" w:lineRule="auto"/>
+      </w:pPr>
+      <w:r>
+        <w:rPr>
+          <w:b/>
+        </w:rPr>
+        <w:t xml:space="preserve">Phòng nhân sự (HR): </w:t>
+      </w:r>
+      <w:r>
+        <w:t>tuyển dụng, quản lý hồ sơ, lương thưởng và các chính sách nhân sự.</w:t>
+      </w:r>
+    </w:p>
+    <w:p>
+      <w:pPr>
+        <w:pStyle w:val="ListBullet"/>
+        <w:numPr>
+          <w:ilvl w:val="0"/>
+          <w:numId w:val="11"/>
+        </w:numPr>
+        <w:spacing w:after="60" w:line="336" w:lineRule="auto"/>
+      </w:pPr>
+      <w:r>
+        <w:rPr>
+          <w:b/>
+        </w:rPr>
+        <w:t xml:space="preserve">Ban giám đốc / quản lý vùng: </w:t>
+      </w:r>
+      <w:r>
+        <w:t>hoạch định chiến lược nhân sự và phê duyệt định biên nhân lực.</w:t>
+      </w:r>
+    </w:p>
+    <w:p>
+      <w:pPr>
+        <w:pStyle w:val="ListBullet"/>
+        <w:numPr>
+          <w:ilvl w:val="0"/>
+          <w:numId w:val="11"/>
+        </w:numPr>
+        <w:spacing w:after="60" w:line="336" w:lineRule="auto"/>
+      </w:pPr>
+      <w:r>
+        <w:rPr>
+          <w:b/>
+        </w:rPr>
+        <w:t xml:space="preserve">Quản lý nhà thuốc: </w:t>
+      </w:r>
+      <w:r>
+        <w:t>đề xuất nhu cầu nhân sự, phân ca và đánh giá nhân viên tại cửa hàng.</w:t>
+      </w:r>
+    </w:p>
+    <w:p>
+      <w:pPr>
+        <w:pStyle w:val="ListBullet"/>
+        <w:numPr>
+          <w:ilvl w:val="0"/>
+          <w:numId w:val="11"/>
+        </w:numPr>
+        <w:spacing w:after="60" w:line="336" w:lineRule="auto"/>
+      </w:pPr>
+      <w:r>
+        <w:rPr>
+          <w:b/>
+        </w:rPr>
+        <w:t xml:space="preserve">Bộ phận đào tạo: </w:t>
+      </w:r>
+      <w:r>
+        <w:t>xây dựng và tổ chức các chương trình đào tạo chuyên môn và kỹ năng.</w:t>
+      </w:r>
+    </w:p>
+    <w:p>
+      <w:pPr>
+        <w:pStyle w:val="ListBullet"/>
+        <w:numPr>
+          <w:ilvl w:val="0"/>
+          <w:numId w:val="11"/>
+        </w:numPr>
+        <w:spacing w:after="60" w:line="336" w:lineRule="auto"/>
+      </w:pPr>
+      <w:r>
+        <w:rPr>
+          <w:b/>
+        </w:rPr>
+        <w:t xml:space="preserve">Dược sĩ / nhân viên: </w:t>
+      </w:r>
+      <w:r>
+        <w:t>đối tượng được tuyển dụng, đào tạo, phân công và đánh giá.</w:t>
+      </w:r>
+    </w:p>
+    <w:p>
+      <w:pPr>
+        <w:pStyle w:val="ListBullet"/>
+        <w:numPr>
+          <w:ilvl w:val="0"/>
+          <w:numId w:val="11"/>
+        </w:numPr>
+        <w:spacing w:after="60" w:line="336" w:lineRule="auto"/>
+      </w:pPr>
+      <w:r>
+        <w:rPr>
+          <w:b/>
+        </w:rPr>
+        <w:t xml:space="preserve">Cơ quan cấp chứng chỉ hành nghề: </w:t>
+      </w:r>
+      <w:r>
+        <w:t>đơn vị nhà nước cấp và quản lý chứng chỉ hành nghề dược.</w:t>
+      </w:r>
+    </w:p>
+    <w:p>
+      <w:pPr>
+        <w:numPr>
+          <w:ilvl w:val="3"/>
+          <w:numId w:val="1"/>
+        </w:numPr>
+        <w:spacing w:after="0"/>
+        <w:rPr>
+          <w:rFonts w:ascii="Times New Roman" w:eastAsia="Times New Roman" w:hAnsi="Times New Roman" w:cs="Times New Roman"/>
+          <w:b/>
+          <w:bCs/>
+          <w:i/>
+          <w:iCs/>
+          <w:sz w:val="26"/>
+          <w:szCs w:val="26"/>
+        </w:rPr>
+      </w:pPr>
+      <w:r>
+        <w:rPr>
+          <w:rFonts w:ascii="Times New Roman" w:eastAsia="Times New Roman" w:hAnsi="Times New Roman"/>
+          <w:b/>
+          <w:sz w:val="26"/>
+        </w:rPr>
+        <w:t>Khách hàng của quy trình này</w:t>
+      </w:r>
+    </w:p>
+    <w:p>
+      <w:pPr>
+        <w:pStyle w:val="ListParagraph"/>
+        <w:spacing w:after="80" w:line="336" w:lineRule="auto"/>
+        <w:ind w:left="1440" w:firstLine="720"/>
+      </w:pPr>
+      <w:r>
+        <w:rPr>
+          <w:rFonts w:ascii="Times New Roman" w:eastAsia="Times New Roman" w:hAnsi="Times New Roman"/>
+          <w:sz w:val="26"/>
+        </w:rPr>
+        <w:t>Khách hàng nội bộ của quy trình là các cửa hàng, nhà thuốc trong hệ thống, vì họ cần được cung cấp đủ nhân sự có chuyên môn để vận hành. Quy trình cũng gián tiếp phục vụ khách hàng cuối, bởi đội ngũ dược sĩ được đào tạo tốt sẽ mang lại dịch vụ tư vấn chất lượng.</w:t>
+      </w:r>
+    </w:p>
+    <w:p>
+      <w:pPr>
+        <w:numPr>
+          <w:ilvl w:val="3"/>
+          <w:numId w:val="1"/>
+        </w:numPr>
+        <w:spacing w:after="0"/>
+        <w:rPr>
+          <w:rFonts w:ascii="Times New Roman" w:eastAsia="Times New Roman" w:hAnsi="Times New Roman" w:cs="Times New Roman"/>
+          <w:b/>
+          <w:bCs/>
+          <w:i/>
+          <w:iCs/>
+          <w:sz w:val="26"/>
+          <w:szCs w:val="26"/>
+        </w:rPr>
+      </w:pPr>
+      <w:r>
+        <w:rPr>
+          <w:rFonts w:ascii="Times New Roman" w:eastAsia="Times New Roman" w:hAnsi="Times New Roman"/>
+          <w:b/>
+          <w:sz w:val="26"/>
+        </w:rPr>
+        <w:t>Những khả năng kết quả của quy trình</w:t>
+      </w:r>
+    </w:p>
+    <w:p>
+      <w:pPr>
+        <w:spacing w:after="80" w:line="336" w:lineRule="auto"/>
+        <w:ind w:left="1080"/>
+      </w:pPr>
+      <w:r>
+        <w:rPr>
+          <w:rFonts w:ascii="Times New Roman" w:eastAsia="Times New Roman" w:hAnsi="Times New Roman"/>
+          <w:b/>
+          <w:sz w:val="26"/>
+        </w:rPr>
+        <w:t xml:space="preserve">Kết quả tích cực: </w:t>
+      </w:r>
+      <w:r>
+        <w:rPr>
+          <w:rFonts w:ascii="Times New Roman" w:eastAsia="Times New Roman" w:hAnsi="Times New Roman"/>
+          <w:sz w:val="26"/>
+        </w:rPr>
+        <w:t>hệ thống luôn đủ nhân sự đạt chuẩn; đội ngũ dược sĩ có chuyên môn vững, tư vấn chất lượng; tỷ lệ nghỉ việc thấp và tuân thủ đầy đủ quy định về hành nghề dược.</w:t>
+      </w:r>
+    </w:p>
+    <w:p>
+      <w:pPr>
+        <w:spacing w:after="80" w:line="336" w:lineRule="auto"/>
+        <w:ind w:left="1080"/>
+      </w:pPr>
+      <w:r>
+        <w:rPr>
+          <w:rFonts w:ascii="Times New Roman" w:eastAsia="Times New Roman" w:hAnsi="Times New Roman"/>
+          <w:b/>
+          <w:sz w:val="26"/>
+        </w:rPr>
+        <w:t>Kết quả tiêu cực:</w:t>
+      </w:r>
+    </w:p>
+    <w:p>
+      <w:pPr>
+        <w:pStyle w:val="ListBullet"/>
+        <w:spacing w:after="60" w:line="336" w:lineRule="auto"/>
+        <w:ind w:left="1080"/>
+      </w:pPr>
+      <w:r>
+        <w:t>Thiếu dược sĩ phụ trách khiến cửa hàng vi phạm quy định, có thể bị đình chỉ hoạt động.</w:t>
+      </w:r>
+    </w:p>
+    <w:p>
+      <w:pPr>
+        <w:pStyle w:val="ListBullet"/>
+        <w:spacing w:after="60" w:line="336" w:lineRule="auto"/>
+        <w:ind w:left="1080"/>
+      </w:pPr>
+      <w:r>
+        <w:t>Đào tạo chưa đầy đủ dẫn đến nhân viên tư vấn sai, ảnh hưởng chất lượng dịch vụ và an toàn của khách.</w:t>
+      </w:r>
+    </w:p>
+    <w:p>
+      <w:pPr>
+        <w:pStyle w:val="ListBullet"/>
+        <w:spacing w:after="60" w:line="336" w:lineRule="auto"/>
+        <w:ind w:left="1080"/>
+      </w:pPr>
+      <w:r>
+        <w:t>Tỷ lệ nghỉ việc cao gây gián đoạn vận hành và tăng chi phí tuyển dụng, đào tạo lại.</w:t>
+      </w:r>
+    </w:p>
+    <w:p>
+      <w:pPr>
+        <w:pStyle w:val="ListBullet"/>
+        <w:spacing w:after="60" w:line="336" w:lineRule="auto"/>
+        <w:ind w:left="1080"/>
+      </w:pPr>
+      <w:r>
+        <w:lastRenderedPageBreak/>
+        <w:t>Chính sách đãi ngộ chưa hợp lý làm giảm động lực và khó giữ chân nhân sự giỏi.</w:t>
       </w:r>
     </w:p>
     <w:sectPr>
@@ -12527,28 +13725,28 @@
 </file>
 
 <file path=customXml/item1.xml><?xml version="1.0" encoding="utf-8"?>
+<b:Sources xmlns:b="http://schemas.openxmlformats.org/officeDocument/2006/bibliography" xmlns="http://schemas.openxmlformats.org/officeDocument/2006/bibliography" SelectedStyle="/APASixthEditionOfficeOnline.xsl" StyleName="APA" Version="6"/>
+</file>
+
+<file path=customXml/item2.xml><?xml version="1.0" encoding="utf-8"?>
 <go:gDocsCustomXmlDataStorage xmlns:go="http://customooxmlschemas.google.com/" xmlns:r="http://schemas.openxmlformats.org/officeDocument/2006/relationships" uri="GoogleDocsCustomDataVersion2">
   <go:docsCustomData xmlns:go="http://customooxmlschemas.google.com/" roundtripDataSignature="AMtx7mi5wgf7jSMe2Dj99jqrtJA/BdJCxg==">CgMxLjAaEgoBMBINCgsIB0IHEgVBcmlhbBoSCgExEg0KCwgHQgcSBUFyaWFsMg5oLmd4YW4wMGRnNzZkMzIOaC45bDc4c3RvcTBlenU4AHIhMWdkeVZmNUt4NmhFd0lBM19GenV5MEI4LXU0emhxYTVW</go:docsCustomData>
 </go:gDocsCustomXmlDataStorage>
 </file>
 
-<file path=customXml/item2.xml><?xml version="1.0" encoding="utf-8"?>
-<b:Sources xmlns:b="http://schemas.openxmlformats.org/officeDocument/2006/bibliography" xmlns="http://schemas.openxmlformats.org/officeDocument/2006/bibliography" SelectedStyle="/APASixthEditionOfficeOnline.xsl" StyleName="APA" Version="6"/>
+<file path=customXml/itemProps1.xml><?xml version="1.0" encoding="utf-8"?>
+<ds:datastoreItem xmlns:ds="http://schemas.openxmlformats.org/officeDocument/2006/customXml" ds:itemID="{8192AD63-BDA7-F14F-96D1-A0092AC98167}">
+  <ds:schemaRefs>
+    <ds:schemaRef ds:uri="http://schemas.openxmlformats.org/officeDocument/2006/bibliography"/>
+  </ds:schemaRefs>
+</ds:datastoreItem>
 </file>
 
-<file path=customXml/itemProps1.xml><?xml version="1.0" encoding="utf-8"?>
+<file path=customXml/itemProps2.xml><?xml version="1.0" encoding="utf-8"?>
 <ds:datastoreItem xmlns:ds="http://schemas.openxmlformats.org/officeDocument/2006/customXml" ds:itemID="{11111111-1234-1234-1234-123412341234}">
   <ds:schemaRefs>
     <ds:schemaRef ds:uri="http://customooxmlschemas.google.com/"/>
     <ds:schemaRef ds:uri="http://schemas.openxmlformats.org/officeDocument/2006/relationships"/>
   </ds:schemaRefs>
 </ds:datastoreItem>
-</file>
-
-<file path=customXml/itemProps2.xml><?xml version="1.0" encoding="utf-8"?>
-<ds:datastoreItem xmlns:ds="http://schemas.openxmlformats.org/officeDocument/2006/customXml" ds:itemID="{8192AD63-BDA7-F14F-96D1-A0092AC98167}">
-  <ds:schemaRefs>
-    <ds:schemaRef ds:uri="http://schemas.openxmlformats.org/officeDocument/2006/bibliography"/>
-  </ds:schemaRefs>
-</ds:datastoreItem>
 </file>
</xml_diff>